<commit_message>
Fix: question display bug, 60s timer, reveal answer, remove dev badge, fix reset navigation, new leaderboard with manual score update
</commit_message>
<xml_diff>
--- a/Question folder/general round/general queestions.docx
+++ b/Question folder/general round/general queestions.docx
@@ -52,7 +52,16 @@
         </w:numPr>
       </w:pPr>
       <w:r>
-        <w:t>In which country are white crows found? — Egypt</w:t>
+        <w:t xml:space="preserve">In which country </w:t>
+      </w:r>
+      <w:r>
+        <w:t xml:space="preserve"> white crows</w:t>
+      </w:r>
+      <w:r>
+        <w:t xml:space="preserve"> are</w:t>
+      </w:r>
+      <w:r>
+        <w:t xml:space="preserve"> found? — Egypt</w:t>
       </w:r>
     </w:p>
     <w:p>
@@ -167,122 +176,164 @@
         </w:numPr>
       </w:pPr>
       <w:r>
-        <w:t>If the place where horses stay is called a stable, what is the place where pigeons stay called? — Cote / Loft (</w:t>
-      </w:r>
-      <w:proofErr w:type="spellStart"/>
-      <w:r>
-        <w:t>Ganj</w:t>
+        <w:t>If the place where horses stay is called a stable, what is the place where pi</w:t>
+      </w:r>
+      <w:r>
+        <w:t xml:space="preserve">geons stay called? —  </w:t>
+      </w:r>
+      <w:proofErr w:type="spellStart"/>
+      <w:r>
+        <w:t>Gunga</w:t>
+      </w:r>
+      <w:proofErr w:type="spellEnd"/>
+      <w:r>
+        <w:t>/</w:t>
+      </w:r>
+      <w:proofErr w:type="spellStart"/>
+      <w:r>
+        <w:t>Kot</w:t>
+      </w:r>
+      <w:proofErr w:type="spellEnd"/>
+    </w:p>
+    <w:p>
+      <w:pPr>
+        <w:pStyle w:val="NoSpacing"/>
+        <w:numPr>
+          <w:ilvl w:val="0"/>
+          <w:numId w:val="1"/>
+        </w:numPr>
+      </w:pPr>
+      <w:r>
+        <w:t>Which country in the world follows a calendar with 13 months in a year? — Ethiopia</w:t>
+      </w:r>
+    </w:p>
+    <w:p>
+      <w:pPr>
+        <w:pStyle w:val="NoSpacing"/>
+        <w:numPr>
+          <w:ilvl w:val="0"/>
+          <w:numId w:val="1"/>
+        </w:numPr>
+      </w:pPr>
+      <w:r>
+        <w:t xml:space="preserve">What is a person who operates a ship called? — </w:t>
+      </w:r>
+      <w:r>
+        <w:t>Sea c</w:t>
+      </w:r>
+      <w:r>
+        <w:t>aptain / Sailor</w:t>
+      </w:r>
+    </w:p>
+    <w:p>
+      <w:pPr>
+        <w:pStyle w:val="NoSpacing"/>
+        <w:numPr>
+          <w:ilvl w:val="0"/>
+          <w:numId w:val="1"/>
+        </w:numPr>
+      </w:pPr>
+      <w:r>
+        <w:t xml:space="preserve">What is the ball used in table tennis called? — </w:t>
+      </w:r>
+      <w:proofErr w:type="spellStart"/>
+      <w:r>
+        <w:t>Ping-pong</w:t>
+      </w:r>
+      <w:proofErr w:type="spellEnd"/>
+      <w:r>
+        <w:t xml:space="preserve"> ball</w:t>
+      </w:r>
+    </w:p>
+    <w:p>
+      <w:pPr>
+        <w:pStyle w:val="NoSpacing"/>
+        <w:numPr>
+          <w:ilvl w:val="0"/>
+          <w:numId w:val="1"/>
+        </w:numPr>
+      </w:pPr>
+      <w:r>
+        <w:t>What is the action/task that can only be done after reaching 18 years of age in Nepal? — Voting</w:t>
+      </w:r>
+    </w:p>
+    <w:p>
+      <w:pPr>
+        <w:pStyle w:val="NoSpacing"/>
+        <w:numPr>
+          <w:ilvl w:val="0"/>
+          <w:numId w:val="1"/>
+        </w:numPr>
+      </w:pPr>
+      <w:r>
+        <w:t xml:space="preserve">Which is the ethnic group with the smallest population in Nepal? — </w:t>
+      </w:r>
+      <w:proofErr w:type="spellStart"/>
+      <w:r>
+        <w:t>Nurang</w:t>
+      </w:r>
+      <w:proofErr w:type="spellEnd"/>
+    </w:p>
+    <w:p>
+      <w:pPr>
+        <w:pStyle w:val="NoSpacing"/>
+        <w:numPr>
+          <w:ilvl w:val="0"/>
+          <w:numId w:val="1"/>
+        </w:numPr>
+        <w:jc w:val="both"/>
+      </w:pPr>
+      <w:r>
+        <w:t xml:space="preserve">If the national bird of Nepal is the </w:t>
+      </w:r>
+      <w:proofErr w:type="spellStart"/>
+      <w:r>
+        <w:t>Danphe</w:t>
+      </w:r>
+      <w:proofErr w:type="spellEnd"/>
+      <w:r>
+        <w:t xml:space="preserve"> (</w:t>
+      </w:r>
+      <w:proofErr w:type="spellStart"/>
+      <w:r>
+        <w:t>Lophophorus</w:t>
+      </w:r>
+      <w:proofErr w:type="spellEnd"/>
+      <w:r>
+        <w:t xml:space="preserve">), what is the national bird of Sri Lanka? — Ceylon </w:t>
+      </w:r>
+      <w:proofErr w:type="spellStart"/>
+      <w:r>
+        <w:t>Junglefowl</w:t>
+      </w:r>
+      <w:proofErr w:type="spellEnd"/>
+      <w:r>
+        <w:t>(</w:t>
+      </w:r>
+      <w:proofErr w:type="spellStart"/>
+      <w:r>
+        <w:t>jangali</w:t>
+      </w:r>
+      <w:proofErr w:type="spellEnd"/>
+      <w:r>
+        <w:t xml:space="preserve"> </w:t>
+      </w:r>
+      <w:proofErr w:type="spellStart"/>
+      <w:r>
+        <w:t>Kukhura</w:t>
+      </w:r>
+      <w:proofErr w:type="spellEnd"/>
+      <w:r>
+        <w:t>/</w:t>
+      </w:r>
+      <w:proofErr w:type="spellStart"/>
+      <w:r>
+        <w:t>luiche</w:t>
       </w:r>
       <w:proofErr w:type="spellEnd"/>
       <w:r>
         <w:t>)</w:t>
       </w:r>
-    </w:p>
-    <w:p>
-      <w:pPr>
-        <w:pStyle w:val="NoSpacing"/>
-        <w:numPr>
-          <w:ilvl w:val="0"/>
-          <w:numId w:val="1"/>
-        </w:numPr>
-      </w:pPr>
-      <w:r>
-        <w:t>Which country in the world follows a calendar with 13 months in a year? — Ethiopia</w:t>
-      </w:r>
-    </w:p>
-    <w:p>
-      <w:pPr>
-        <w:pStyle w:val="NoSpacing"/>
-        <w:numPr>
-          <w:ilvl w:val="0"/>
-          <w:numId w:val="1"/>
-        </w:numPr>
-      </w:pPr>
-      <w:r>
-        <w:t>What is a person who operates a ship called? — Captain / Sailor</w:t>
-      </w:r>
-    </w:p>
-    <w:p>
-      <w:pPr>
-        <w:pStyle w:val="NoSpacing"/>
-        <w:numPr>
-          <w:ilvl w:val="0"/>
-          <w:numId w:val="1"/>
-        </w:numPr>
-      </w:pPr>
-      <w:r>
-        <w:t xml:space="preserve">What is the ball used in table tennis called? — </w:t>
-      </w:r>
-      <w:proofErr w:type="spellStart"/>
-      <w:r>
-        <w:t>Ping-pong</w:t>
-      </w:r>
-      <w:proofErr w:type="spellEnd"/>
-      <w:r>
-        <w:t xml:space="preserve"> ball</w:t>
-      </w:r>
-    </w:p>
-    <w:p>
-      <w:pPr>
-        <w:pStyle w:val="NoSpacing"/>
-        <w:numPr>
-          <w:ilvl w:val="0"/>
-          <w:numId w:val="1"/>
-        </w:numPr>
-      </w:pPr>
-      <w:r>
-        <w:t>What is the action/task that can only be done after reaching 18 years of age in Nepal? — Voting</w:t>
-      </w:r>
-    </w:p>
-    <w:p>
-      <w:pPr>
-        <w:pStyle w:val="NoSpacing"/>
-        <w:numPr>
-          <w:ilvl w:val="0"/>
-          <w:numId w:val="1"/>
-        </w:numPr>
-      </w:pPr>
-      <w:r>
-        <w:t xml:space="preserve">Which is the ethnic group with the smallest population in Nepal? — </w:t>
-      </w:r>
-      <w:proofErr w:type="spellStart"/>
-      <w:r>
-        <w:t>Nurang</w:t>
-      </w:r>
-      <w:proofErr w:type="spellEnd"/>
-    </w:p>
-    <w:p>
-      <w:pPr>
-        <w:pStyle w:val="NoSpacing"/>
-        <w:numPr>
-          <w:ilvl w:val="0"/>
-          <w:numId w:val="1"/>
-        </w:numPr>
-      </w:pPr>
-      <w:r>
-        <w:t xml:space="preserve">If the national bird of Nepal is the </w:t>
-      </w:r>
-      <w:proofErr w:type="spellStart"/>
-      <w:r>
-        <w:t>Danphe</w:t>
-      </w:r>
-      <w:proofErr w:type="spellEnd"/>
-      <w:r>
-        <w:t xml:space="preserve"> (</w:t>
-      </w:r>
-      <w:proofErr w:type="spellStart"/>
-      <w:r>
-        <w:t>Lophophorus</w:t>
-      </w:r>
-      <w:proofErr w:type="spellEnd"/>
-      <w:r>
-        <w:t xml:space="preserve">), what is the national bird of Sri Lanka? — Ceylon </w:t>
-      </w:r>
-      <w:proofErr w:type="spellStart"/>
-      <w:r>
-        <w:t>Junglefowl</w:t>
-      </w:r>
-      <w:proofErr w:type="spellEnd"/>
     </w:p>
     <w:p>
       <w:pPr>
@@ -411,11 +462,17 @@
         </w:numPr>
       </w:pPr>
       <w:r>
-        <w:t xml:space="preserve">What is "Calculator" called in Nepali? — </w:t>
-      </w:r>
-      <w:proofErr w:type="spellStart"/>
-      <w:r>
-        <w:t>Ganak</w:t>
+        <w:t>What is "Calc</w:t>
+      </w:r>
+      <w:r>
+        <w:t xml:space="preserve">ulator" called in Nepali? — </w:t>
+      </w:r>
+      <w:proofErr w:type="spellStart"/>
+      <w:r>
+        <w:t>Gunan</w:t>
+      </w:r>
+      <w:r>
+        <w:t>k</w:t>
       </w:r>
       <w:proofErr w:type="spellEnd"/>
       <w:r>
@@ -663,7 +720,10 @@
       </w:r>
       <w:proofErr w:type="spellEnd"/>
       <w:r>
-        <w:t xml:space="preserve"> Province officially named? — October 6, 2020 (2077 </w:t>
+        <w:t xml:space="preserve"> Province officially named</w:t>
+      </w:r>
+      <w:r>
+        <w:t xml:space="preserve"> in B.S? — 2077 </w:t>
       </w:r>
       <w:proofErr w:type="spellStart"/>
       <w:r>
@@ -671,7 +731,7 @@
       </w:r>
       <w:proofErr w:type="spellEnd"/>
       <w:r>
-        <w:t xml:space="preserve"> 20 BS)</w:t>
+        <w:t xml:space="preserve"> 20 BS</w:t>
       </w:r>
     </w:p>
     <w:p>
@@ -698,6 +758,14 @@
         <w:t>Dhangadhi</w:t>
       </w:r>
       <w:proofErr w:type="spellEnd"/>
+      <w:r>
+        <w:t>/</w:t>
+      </w:r>
+      <w:proofErr w:type="spellStart"/>
+      <w:r>
+        <w:t>Kailali</w:t>
+      </w:r>
+      <w:proofErr w:type="spellEnd"/>
     </w:p>
     <w:p>
       <w:pPr>
@@ -724,7 +792,18 @@
       </w:r>
       <w:proofErr w:type="spellEnd"/>
       <w:r>
-        <w:t>-Hillary)</w:t>
+        <w:t>-Hillary</w:t>
+      </w:r>
+      <w:r>
+        <w:t>/</w:t>
+      </w:r>
+      <w:proofErr w:type="spellStart"/>
+      <w:r>
+        <w:t>SyanBoche</w:t>
+      </w:r>
+      <w:proofErr w:type="spellEnd"/>
+      <w:r>
+        <w:t>)</w:t>
       </w:r>
     </w:p>
     <w:p>
@@ -829,7 +908,10 @@
         </w:numPr>
       </w:pPr>
       <w:r>
-        <w:t xml:space="preserve">Who ordered the construction of </w:t>
+        <w:t>Who ordered the construction of</w:t>
+      </w:r>
+      <w:r>
+        <w:t xml:space="preserve"> </w:t>
       </w:r>
       <w:proofErr w:type="spellStart"/>
       <w:r>
@@ -837,24 +919,63 @@
       </w:r>
       <w:proofErr w:type="spellEnd"/>
       <w:r>
-        <w:t xml:space="preserve"> Palace? — Veer </w:t>
-      </w:r>
-      <w:proofErr w:type="spellStart"/>
-      <w:r>
-        <w:t>Shumsher</w:t>
-      </w:r>
-      <w:proofErr w:type="spellEnd"/>
-    </w:p>
-    <w:p>
-      <w:pPr>
-        <w:pStyle w:val="NoSpacing"/>
-        <w:numPr>
-          <w:ilvl w:val="0"/>
-          <w:numId w:val="1"/>
-        </w:numPr>
-      </w:pPr>
-      <w:r>
-        <w:t>Which nations are participating in the FIFA World Cup 2026 for the first time from Asia? — Jordan and Uzbekistan</w:t>
+        <w:t xml:space="preserve"> Palace? — </w:t>
+      </w:r>
+      <w:proofErr w:type="spellStart"/>
+      <w:r>
+        <w:t>Bhir</w:t>
+      </w:r>
+      <w:proofErr w:type="spellEnd"/>
+      <w:r>
+        <w:t xml:space="preserve"> </w:t>
+      </w:r>
+      <w:proofErr w:type="spellStart"/>
+      <w:r>
+        <w:t>Sha</w:t>
+      </w:r>
+      <w:r>
+        <w:t>msher</w:t>
+      </w:r>
+      <w:proofErr w:type="spellEnd"/>
+    </w:p>
+    <w:p>
+      <w:pPr>
+        <w:pStyle w:val="NoSpacing"/>
+        <w:numPr>
+          <w:ilvl w:val="0"/>
+          <w:numId w:val="1"/>
+        </w:numPr>
+      </w:pPr>
+      <w:r>
+        <w:t xml:space="preserve">Which nations are participating in the FIFA World Cup 2026 for the first time from Asia? — Jordan and </w:t>
+      </w:r>
+      <w:proofErr w:type="spellStart"/>
+      <w:r>
+        <w:t>Uz</w:t>
+      </w:r>
+      <w:r>
+        <w:t>e</w:t>
+      </w:r>
+      <w:r>
+        <w:t>bekistan</w:t>
+      </w:r>
+      <w:proofErr w:type="spellEnd"/>
+      <w:r>
+        <w:t>(</w:t>
+      </w:r>
+      <w:proofErr w:type="spellStart"/>
+      <w:r>
+        <w:rPr>
+          <w:rFonts w:ascii="Nirmala UI" w:hAnsi="Nirmala UI" w:cs="Nirmala UI"/>
+        </w:rPr>
+        <w:t>उज्बेकिस्तान</w:t>
+      </w:r>
+      <w:proofErr w:type="spellEnd"/>
+      <w:r>
+        <w:rPr>
+          <w:rFonts w:ascii="Nirmala UI" w:hAnsi="Nirmala UI" w:cs="Nirmala UI"/>
+        </w:rPr>
+        <w:t>)</w:t>
       </w:r>
     </w:p>
     <w:p>
@@ -890,7 +1011,6 @@
         </w:numPr>
       </w:pPr>
       <w:r>
-        <w:lastRenderedPageBreak/>
         <w:t xml:space="preserve">In which district is </w:t>
       </w:r>
       <w:proofErr w:type="spellStart"/>
@@ -916,7 +1036,7 @@
         </w:numPr>
       </w:pPr>
       <w:r>
-        <w:t>Which organ in the human body consumes/uses the most blood? — Liver</w:t>
+        <w:t>What is the largest internal organ of human body- Liver</w:t>
       </w:r>
     </w:p>
     <w:p>
@@ -930,6 +1050,8 @@
       <w:r>
         <w:t>In which country was the railway invented? — England</w:t>
       </w:r>
+      <w:bookmarkStart w:id="0" w:name="_GoBack"/>
+      <w:bookmarkEnd w:id="0"/>
     </w:p>
     <w:p>
       <w:pPr>
@@ -1147,8 +1269,6 @@
       <w:pPr>
         <w:pStyle w:val="NoSpacing"/>
       </w:pPr>
-      <w:bookmarkStart w:id="0" w:name="_GoBack"/>
-      <w:bookmarkEnd w:id="0"/>
     </w:p>
     <w:sectPr>
       <w:pgSz w:w="12240" w:h="15840"/>

</xml_diff>